<commit_message>
Clear docx footers; add PDF export
Add a generated PDF and update the docx build script to remove conference copyright footers.

Changes:
- Added docs/Tarea3-EstilosIntegracionAPIs.pdf
- Updated docs/Tarea3-EstilosIntegracionAPIs.docx (binary)
- Modified scripts/build_docx.py: introduced clear_footers(document) to unlink and empty first/even/default footers and called it from build() to remove the conference copyright marker from the template.

Reason: remove template-specific footer content from generated documents.
</commit_message>
<xml_diff>
--- a/docs/Tarea3-EstilosIntegracionAPIs.docx
+++ b/docs/Tarea3-EstilosIntegracionAPIs.docx
@@ -24,6 +24,8 @@
         </w:rPr>
         <w:sectPr>
           <w:footerReference w:type="first" r:id="rId8"/>
+          <w:footerReference w:type="even" r:id="rId13"/>
+          <w:footerReference w:type="default" r:id="rId14"/>
           <w:pgSz w:w="11906" w:h="16838" w:code="9"/>
           <w:pgMar w:top="540" w:right="893" w:bottom="1440" w:left="893" w:header="720" w:footer="720" w:gutter="0"/>
           <w:cols w:space="720"/>
@@ -73,6 +75,9 @@
     <w:p>
       <w:pPr>
         <w:sectPr>
+          <w:footerReference w:type="first" r:id="rId15"/>
+          <w:footerReference w:type="even" r:id="rId16"/>
+          <w:footerReference w:type="default" r:id="rId17"/>
           <w:type w:val="continuous"/>
           <w:pgSz w:w="11906" w:h="16838" w:code="9"/>
           <w:pgMar w:top="450" w:right="893" w:bottom="1440" w:left="893" w:header="720" w:footer="720" w:gutter="0"/>
@@ -392,6 +397,9 @@
           <w:sz w:val="2"/>
         </w:rPr>
         <w:sectPr>
+          <w:footerReference w:type="first" r:id="rId18"/>
+          <w:footerReference w:type="even" r:id="rId19"/>
+          <w:footerReference w:type="default" r:id="rId20"/>
           <w:type w:val="continuous"/>
           <w:pgSz w:w="11906" w:h="16838" w:code="9"/>
           <w:pgMar w:top="1080" w:right="907" w:bottom="1440" w:left="907" w:header="720" w:footer="720" w:gutter="0"/>
@@ -1207,6 +1215,9 @@
           <w:sz w:val="2"/>
         </w:rPr>
         <w:sectPr>
+          <w:footerReference w:type="first" r:id="rId18"/>
+          <w:footerReference w:type="even" r:id="rId19"/>
+          <w:footerReference w:type="default" r:id="rId20"/>
           <w:type w:val="continuous"/>
           <w:pgSz w:w="11906" w:h="16838" w:code="9"/>
           <w:pgMar w:top="1080" w:right="907" w:bottom="1440" w:left="907" w:header="720" w:footer="720" w:gutter="0"/>
@@ -1222,6 +1233,9 @@
           <w:sz w:val="2"/>
         </w:rPr>
         <w:sectPr>
+          <w:footerReference w:type="first" r:id="rId18"/>
+          <w:footerReference w:type="even" r:id="rId19"/>
+          <w:footerReference w:type="default" r:id="rId20"/>
           <w:type w:val="continuous"/>
           <w:pgSz w:w="11906" w:h="16838" w:code="9"/>
           <w:pgMar w:top="1080" w:right="907" w:bottom="1440" w:left="907" w:header="720" w:footer="720" w:gutter="0"/>
@@ -1500,6 +1514,9 @@
           <w:sz w:val="2"/>
         </w:rPr>
         <w:sectPr>
+          <w:footerReference w:type="first" r:id="rId18"/>
+          <w:footerReference w:type="even" r:id="rId19"/>
+          <w:footerReference w:type="default" r:id="rId20"/>
           <w:type w:val="continuous"/>
           <w:pgSz w:w="11906" w:h="16838" w:code="9"/>
           <w:pgMar w:top="1080" w:right="907" w:bottom="1440" w:left="907" w:header="720" w:footer="720" w:gutter="0"/>
@@ -1515,6 +1532,9 @@
           <w:sz w:val="2"/>
         </w:rPr>
         <w:sectPr>
+          <w:footerReference w:type="first" r:id="rId18"/>
+          <w:footerReference w:type="even" r:id="rId19"/>
+          <w:footerReference w:type="default" r:id="rId20"/>
           <w:type w:val="continuous"/>
           <w:pgSz w:w="11906" w:h="16838" w:code="9"/>
           <w:pgMar w:top="1080" w:right="907" w:bottom="1440" w:left="907" w:header="720" w:footer="720" w:gutter="0"/>
@@ -1887,6 +1907,9 @@
           <w:sz w:val="2"/>
         </w:rPr>
         <w:sectPr>
+          <w:footerReference w:type="first" r:id="rId18"/>
+          <w:footerReference w:type="even" r:id="rId19"/>
+          <w:footerReference w:type="default" r:id="rId20"/>
           <w:type w:val="continuous"/>
           <w:pgSz w:w="11906" w:h="16838" w:code="9"/>
           <w:pgMar w:top="1080" w:right="907" w:bottom="1440" w:left="907" w:header="720" w:footer="720" w:gutter="0"/>
@@ -2364,6 +2387,9 @@
           <w:lang w:val="x-none" w:eastAsia="x-none"/>
         </w:rPr>
         <w:sectPr>
+          <w:footerReference w:type="first" r:id="rId18"/>
+          <w:footerReference w:type="even" r:id="rId19"/>
+          <w:footerReference w:type="default" r:id="rId20"/>
           <w:type w:val="continuous"/>
           <w:pgSz w:w="11906" w:h="16838" w:code="9"/>
           <w:pgMar w:top="1080" w:right="907" w:bottom="1440" w:left="907" w:header="720" w:footer="720" w:gutter="0"/>
@@ -2374,6 +2400,9 @@
     </w:p>
     <w:p/>
     <w:sectPr>
+      <w:footerReference w:type="first" r:id="rId21"/>
+      <w:footerReference w:type="even" r:id="rId22"/>
+      <w:footerReference w:type="default" r:id="rId23"/>
       <w:type w:val="continuous"/>
       <w:pgSz w:w="11906" w:h="16838" w:code="9"/>
       <w:pgMar w:top="1080" w:right="893" w:bottom="1440" w:left="893" w:header="720" w:footer="720" w:gutter="0"/>
@@ -2414,13 +2443,116 @@
         <w:szCs w:val="16"/>
       </w:rPr>
     </w:pPr>
-    <w:r>
-      <w:rPr>
-        <w:sz w:val="16"/>
-        <w:szCs w:val="16"/>
-      </w:rPr>
-      <w:t>XXX-X-XXXX-XXXX-X/XX/$XX.00 ©20XX IEEE</w:t>
-    </w:r>
+  </w:p>
+</w:ftr>
+</file>
+
+<file path=word/footer10.xml><?xml version="1.0" encoding="utf-8"?>
+<w:ftr xmlns:m="http://schemas.openxmlformats.org/officeDocument/2006/math" xmlns:mc="http://schemas.openxmlformats.org/markup-compatibility/2006" xmlns:mo="http://schemas.microsoft.com/office/mac/office/2008/main" xmlns:mv="urn:schemas-microsoft-com:mac:vml" xmlns:o="urn:schemas-microsoft-com:office:office" xmlns:r="http://schemas.openxmlformats.org/officeDocument/2006/relationships" xmlns:v="urn:schemas-microsoft-com:vml" xmlns:w10="urn:schemas-microsoft-com:office:word" xmlns:w14="http://schemas.microsoft.com/office/word/2010/wordml" xmlns:w="http://schemas.openxmlformats.org/wordprocessingml/2006/main" xmlns:wne="http://schemas.microsoft.com/office/word/2006/wordml" xmlns:wp14="http://schemas.microsoft.com/office/word/2010/wordprocessingDrawing" xmlns:wp="http://schemas.openxmlformats.org/drawingml/2006/wordprocessingDrawing" xmlns:wpc="http://schemas.microsoft.com/office/word/2010/wordprocessingCanvas" xmlns:wpg="http://schemas.microsoft.com/office/word/2010/wordprocessingGroup" xmlns:wpi="http://schemas.microsoft.com/office/word/2010/wordprocessingInk" xmlns:wps="http://schemas.microsoft.com/office/word/2010/wordprocessingShape" mc:Ignorable="w14 wp14">
+  <w:p>
+    <w:pPr>
+      <w:pStyle w:val="Footer"/>
+    </w:pPr>
+  </w:p>
+</w:ftr>
+</file>
+
+<file path=word/footer11.xml><?xml version="1.0" encoding="utf-8"?>
+<w:ftr xmlns:m="http://schemas.openxmlformats.org/officeDocument/2006/math" xmlns:mc="http://schemas.openxmlformats.org/markup-compatibility/2006" xmlns:mo="http://schemas.microsoft.com/office/mac/office/2008/main" xmlns:mv="urn:schemas-microsoft-com:mac:vml" xmlns:o="urn:schemas-microsoft-com:office:office" xmlns:r="http://schemas.openxmlformats.org/officeDocument/2006/relationships" xmlns:v="urn:schemas-microsoft-com:vml" xmlns:w10="urn:schemas-microsoft-com:office:word" xmlns:w14="http://schemas.microsoft.com/office/word/2010/wordml" xmlns:w="http://schemas.openxmlformats.org/wordprocessingml/2006/main" xmlns:wne="http://schemas.microsoft.com/office/word/2006/wordml" xmlns:wp14="http://schemas.microsoft.com/office/word/2010/wordprocessingDrawing" xmlns:wp="http://schemas.openxmlformats.org/drawingml/2006/wordprocessingDrawing" xmlns:wpc="http://schemas.microsoft.com/office/word/2010/wordprocessingCanvas" xmlns:wpg="http://schemas.microsoft.com/office/word/2010/wordprocessingGroup" xmlns:wpi="http://schemas.microsoft.com/office/word/2010/wordprocessingInk" xmlns:wps="http://schemas.microsoft.com/office/word/2010/wordprocessingShape" mc:Ignorable="w14 wp14">
+  <w:p>
+    <w:pPr>
+      <w:pStyle w:val="Footer"/>
+    </w:pPr>
+  </w:p>
+</w:ftr>
+</file>
+
+<file path=word/footer12.xml><?xml version="1.0" encoding="utf-8"?>
+<w:ftr xmlns:m="http://schemas.openxmlformats.org/officeDocument/2006/math" xmlns:mc="http://schemas.openxmlformats.org/markup-compatibility/2006" xmlns:mo="http://schemas.microsoft.com/office/mac/office/2008/main" xmlns:mv="urn:schemas-microsoft-com:mac:vml" xmlns:o="urn:schemas-microsoft-com:office:office" xmlns:r="http://schemas.openxmlformats.org/officeDocument/2006/relationships" xmlns:v="urn:schemas-microsoft-com:vml" xmlns:w10="urn:schemas-microsoft-com:office:word" xmlns:w14="http://schemas.microsoft.com/office/word/2010/wordml" xmlns:w="http://schemas.openxmlformats.org/wordprocessingml/2006/main" xmlns:wne="http://schemas.microsoft.com/office/word/2006/wordml" xmlns:wp14="http://schemas.microsoft.com/office/word/2010/wordprocessingDrawing" xmlns:wp="http://schemas.openxmlformats.org/drawingml/2006/wordprocessingDrawing" xmlns:wpc="http://schemas.microsoft.com/office/word/2010/wordprocessingCanvas" xmlns:wpg="http://schemas.microsoft.com/office/word/2010/wordprocessingGroup" xmlns:wpi="http://schemas.microsoft.com/office/word/2010/wordprocessingInk" xmlns:wps="http://schemas.microsoft.com/office/word/2010/wordprocessingShape" mc:Ignorable="w14 wp14">
+  <w:p>
+    <w:pPr>
+      <w:pStyle w:val="Footer"/>
+    </w:pPr>
+  </w:p>
+</w:ftr>
+</file>
+
+<file path=word/footer2.xml><?xml version="1.0" encoding="utf-8"?>
+<w:ftr xmlns:m="http://schemas.openxmlformats.org/officeDocument/2006/math" xmlns:mc="http://schemas.openxmlformats.org/markup-compatibility/2006" xmlns:mo="http://schemas.microsoft.com/office/mac/office/2008/main" xmlns:mv="urn:schemas-microsoft-com:mac:vml" xmlns:o="urn:schemas-microsoft-com:office:office" xmlns:r="http://schemas.openxmlformats.org/officeDocument/2006/relationships" xmlns:v="urn:schemas-microsoft-com:vml" xmlns:w10="urn:schemas-microsoft-com:office:word" xmlns:w14="http://schemas.microsoft.com/office/word/2010/wordml" xmlns:w="http://schemas.openxmlformats.org/wordprocessingml/2006/main" xmlns:wne="http://schemas.microsoft.com/office/word/2006/wordml" xmlns:wp14="http://schemas.microsoft.com/office/word/2010/wordprocessingDrawing" xmlns:wp="http://schemas.openxmlformats.org/drawingml/2006/wordprocessingDrawing" xmlns:wpc="http://schemas.microsoft.com/office/word/2010/wordprocessingCanvas" xmlns:wpg="http://schemas.microsoft.com/office/word/2010/wordprocessingGroup" xmlns:wpi="http://schemas.microsoft.com/office/word/2010/wordprocessingInk" xmlns:wps="http://schemas.microsoft.com/office/word/2010/wordprocessingShape" mc:Ignorable="w14 wp14">
+  <w:p>
+    <w:pPr>
+      <w:pStyle w:val="Footer"/>
+    </w:pPr>
+  </w:p>
+</w:ftr>
+</file>
+
+<file path=word/footer3.xml><?xml version="1.0" encoding="utf-8"?>
+<w:ftr xmlns:m="http://schemas.openxmlformats.org/officeDocument/2006/math" xmlns:mc="http://schemas.openxmlformats.org/markup-compatibility/2006" xmlns:mo="http://schemas.microsoft.com/office/mac/office/2008/main" xmlns:mv="urn:schemas-microsoft-com:mac:vml" xmlns:o="urn:schemas-microsoft-com:office:office" xmlns:r="http://schemas.openxmlformats.org/officeDocument/2006/relationships" xmlns:v="urn:schemas-microsoft-com:vml" xmlns:w10="urn:schemas-microsoft-com:office:word" xmlns:w14="http://schemas.microsoft.com/office/word/2010/wordml" xmlns:w="http://schemas.openxmlformats.org/wordprocessingml/2006/main" xmlns:wne="http://schemas.microsoft.com/office/word/2006/wordml" xmlns:wp14="http://schemas.microsoft.com/office/word/2010/wordprocessingDrawing" xmlns:wp="http://schemas.openxmlformats.org/drawingml/2006/wordprocessingDrawing" xmlns:wpc="http://schemas.microsoft.com/office/word/2010/wordprocessingCanvas" xmlns:wpg="http://schemas.microsoft.com/office/word/2010/wordprocessingGroup" xmlns:wpi="http://schemas.microsoft.com/office/word/2010/wordprocessingInk" xmlns:wps="http://schemas.microsoft.com/office/word/2010/wordprocessingShape" mc:Ignorable="w14 wp14">
+  <w:p>
+    <w:pPr>
+      <w:pStyle w:val="Footer"/>
+    </w:pPr>
+  </w:p>
+</w:ftr>
+</file>
+
+<file path=word/footer4.xml><?xml version="1.0" encoding="utf-8"?>
+<w:ftr xmlns:m="http://schemas.openxmlformats.org/officeDocument/2006/math" xmlns:mc="http://schemas.openxmlformats.org/markup-compatibility/2006" xmlns:mo="http://schemas.microsoft.com/office/mac/office/2008/main" xmlns:mv="urn:schemas-microsoft-com:mac:vml" xmlns:o="urn:schemas-microsoft-com:office:office" xmlns:r="http://schemas.openxmlformats.org/officeDocument/2006/relationships" xmlns:v="urn:schemas-microsoft-com:vml" xmlns:w10="urn:schemas-microsoft-com:office:word" xmlns:w14="http://schemas.microsoft.com/office/word/2010/wordml" xmlns:w="http://schemas.openxmlformats.org/wordprocessingml/2006/main" xmlns:wne="http://schemas.microsoft.com/office/word/2006/wordml" xmlns:wp14="http://schemas.microsoft.com/office/word/2010/wordprocessingDrawing" xmlns:wp="http://schemas.openxmlformats.org/drawingml/2006/wordprocessingDrawing" xmlns:wpc="http://schemas.microsoft.com/office/word/2010/wordprocessingCanvas" xmlns:wpg="http://schemas.microsoft.com/office/word/2010/wordprocessingGroup" xmlns:wpi="http://schemas.microsoft.com/office/word/2010/wordprocessingInk" xmlns:wps="http://schemas.microsoft.com/office/word/2010/wordprocessingShape" mc:Ignorable="w14 wp14">
+  <w:p>
+    <w:pPr>
+      <w:pStyle w:val="Footer"/>
+    </w:pPr>
+  </w:p>
+</w:ftr>
+</file>
+
+<file path=word/footer5.xml><?xml version="1.0" encoding="utf-8"?>
+<w:ftr xmlns:m="http://schemas.openxmlformats.org/officeDocument/2006/math" xmlns:mc="http://schemas.openxmlformats.org/markup-compatibility/2006" xmlns:mo="http://schemas.microsoft.com/office/mac/office/2008/main" xmlns:mv="urn:schemas-microsoft-com:mac:vml" xmlns:o="urn:schemas-microsoft-com:office:office" xmlns:r="http://schemas.openxmlformats.org/officeDocument/2006/relationships" xmlns:v="urn:schemas-microsoft-com:vml" xmlns:w10="urn:schemas-microsoft-com:office:word" xmlns:w14="http://schemas.microsoft.com/office/word/2010/wordml" xmlns:w="http://schemas.openxmlformats.org/wordprocessingml/2006/main" xmlns:wne="http://schemas.microsoft.com/office/word/2006/wordml" xmlns:wp14="http://schemas.microsoft.com/office/word/2010/wordprocessingDrawing" xmlns:wp="http://schemas.openxmlformats.org/drawingml/2006/wordprocessingDrawing" xmlns:wpc="http://schemas.microsoft.com/office/word/2010/wordprocessingCanvas" xmlns:wpg="http://schemas.microsoft.com/office/word/2010/wordprocessingGroup" xmlns:wpi="http://schemas.microsoft.com/office/word/2010/wordprocessingInk" xmlns:wps="http://schemas.microsoft.com/office/word/2010/wordprocessingShape" mc:Ignorable="w14 wp14">
+  <w:p>
+    <w:pPr>
+      <w:pStyle w:val="Footer"/>
+    </w:pPr>
+  </w:p>
+</w:ftr>
+</file>
+
+<file path=word/footer6.xml><?xml version="1.0" encoding="utf-8"?>
+<w:ftr xmlns:m="http://schemas.openxmlformats.org/officeDocument/2006/math" xmlns:mc="http://schemas.openxmlformats.org/markup-compatibility/2006" xmlns:mo="http://schemas.microsoft.com/office/mac/office/2008/main" xmlns:mv="urn:schemas-microsoft-com:mac:vml" xmlns:o="urn:schemas-microsoft-com:office:office" xmlns:r="http://schemas.openxmlformats.org/officeDocument/2006/relationships" xmlns:v="urn:schemas-microsoft-com:vml" xmlns:w10="urn:schemas-microsoft-com:office:word" xmlns:w14="http://schemas.microsoft.com/office/word/2010/wordml" xmlns:w="http://schemas.openxmlformats.org/wordprocessingml/2006/main" xmlns:wne="http://schemas.microsoft.com/office/word/2006/wordml" xmlns:wp14="http://schemas.microsoft.com/office/word/2010/wordprocessingDrawing" xmlns:wp="http://schemas.openxmlformats.org/drawingml/2006/wordprocessingDrawing" xmlns:wpc="http://schemas.microsoft.com/office/word/2010/wordprocessingCanvas" xmlns:wpg="http://schemas.microsoft.com/office/word/2010/wordprocessingGroup" xmlns:wpi="http://schemas.microsoft.com/office/word/2010/wordprocessingInk" xmlns:wps="http://schemas.microsoft.com/office/word/2010/wordprocessingShape" mc:Ignorable="w14 wp14">
+  <w:p>
+    <w:pPr>
+      <w:pStyle w:val="Footer"/>
+    </w:pPr>
+  </w:p>
+</w:ftr>
+</file>
+
+<file path=word/footer7.xml><?xml version="1.0" encoding="utf-8"?>
+<w:ftr xmlns:m="http://schemas.openxmlformats.org/officeDocument/2006/math" xmlns:mc="http://schemas.openxmlformats.org/markup-compatibility/2006" xmlns:mo="http://schemas.microsoft.com/office/mac/office/2008/main" xmlns:mv="urn:schemas-microsoft-com:mac:vml" xmlns:o="urn:schemas-microsoft-com:office:office" xmlns:r="http://schemas.openxmlformats.org/officeDocument/2006/relationships" xmlns:v="urn:schemas-microsoft-com:vml" xmlns:w10="urn:schemas-microsoft-com:office:word" xmlns:w14="http://schemas.microsoft.com/office/word/2010/wordml" xmlns:w="http://schemas.openxmlformats.org/wordprocessingml/2006/main" xmlns:wne="http://schemas.microsoft.com/office/word/2006/wordml" xmlns:wp14="http://schemas.microsoft.com/office/word/2010/wordprocessingDrawing" xmlns:wp="http://schemas.openxmlformats.org/drawingml/2006/wordprocessingDrawing" xmlns:wpc="http://schemas.microsoft.com/office/word/2010/wordprocessingCanvas" xmlns:wpg="http://schemas.microsoft.com/office/word/2010/wordprocessingGroup" xmlns:wpi="http://schemas.microsoft.com/office/word/2010/wordprocessingInk" xmlns:wps="http://schemas.microsoft.com/office/word/2010/wordprocessingShape" mc:Ignorable="w14 wp14">
+  <w:p>
+    <w:pPr>
+      <w:pStyle w:val="Footer"/>
+    </w:pPr>
+  </w:p>
+</w:ftr>
+</file>
+
+<file path=word/footer8.xml><?xml version="1.0" encoding="utf-8"?>
+<w:ftr xmlns:m="http://schemas.openxmlformats.org/officeDocument/2006/math" xmlns:mc="http://schemas.openxmlformats.org/markup-compatibility/2006" xmlns:mo="http://schemas.microsoft.com/office/mac/office/2008/main" xmlns:mv="urn:schemas-microsoft-com:mac:vml" xmlns:o="urn:schemas-microsoft-com:office:office" xmlns:r="http://schemas.openxmlformats.org/officeDocument/2006/relationships" xmlns:v="urn:schemas-microsoft-com:vml" xmlns:w10="urn:schemas-microsoft-com:office:word" xmlns:w14="http://schemas.microsoft.com/office/word/2010/wordml" xmlns:w="http://schemas.openxmlformats.org/wordprocessingml/2006/main" xmlns:wne="http://schemas.microsoft.com/office/word/2006/wordml" xmlns:wp14="http://schemas.microsoft.com/office/word/2010/wordprocessingDrawing" xmlns:wp="http://schemas.openxmlformats.org/drawingml/2006/wordprocessingDrawing" xmlns:wpc="http://schemas.microsoft.com/office/word/2010/wordprocessingCanvas" xmlns:wpg="http://schemas.microsoft.com/office/word/2010/wordprocessingGroup" xmlns:wpi="http://schemas.microsoft.com/office/word/2010/wordprocessingInk" xmlns:wps="http://schemas.microsoft.com/office/word/2010/wordprocessingShape" mc:Ignorable="w14 wp14">
+  <w:p>
+    <w:pPr>
+      <w:pStyle w:val="Footer"/>
+    </w:pPr>
+  </w:p>
+</w:ftr>
+</file>
+
+<file path=word/footer9.xml><?xml version="1.0" encoding="utf-8"?>
+<w:ftr xmlns:m="http://schemas.openxmlformats.org/officeDocument/2006/math" xmlns:mc="http://schemas.openxmlformats.org/markup-compatibility/2006" xmlns:mo="http://schemas.microsoft.com/office/mac/office/2008/main" xmlns:mv="urn:schemas-microsoft-com:mac:vml" xmlns:o="urn:schemas-microsoft-com:office:office" xmlns:r="http://schemas.openxmlformats.org/officeDocument/2006/relationships" xmlns:v="urn:schemas-microsoft-com:vml" xmlns:w10="urn:schemas-microsoft-com:office:word" xmlns:w14="http://schemas.microsoft.com/office/word/2010/wordml" xmlns:w="http://schemas.openxmlformats.org/wordprocessingml/2006/main" xmlns:wne="http://schemas.microsoft.com/office/word/2006/wordml" xmlns:wp14="http://schemas.microsoft.com/office/word/2010/wordprocessingDrawing" xmlns:wp="http://schemas.openxmlformats.org/drawingml/2006/wordprocessingDrawing" xmlns:wpc="http://schemas.microsoft.com/office/word/2010/wordprocessingCanvas" xmlns:wpg="http://schemas.microsoft.com/office/word/2010/wordprocessingGroup" xmlns:wpi="http://schemas.microsoft.com/office/word/2010/wordprocessingInk" xmlns:wps="http://schemas.microsoft.com/office/word/2010/wordprocessingShape" mc:Ignorable="w14 wp14">
+  <w:p>
+    <w:pPr>
+      <w:pStyle w:val="Footer"/>
+    </w:pPr>
   </w:p>
 </w:ftr>
 </file>

</xml_diff>

<commit_message>
Update docs and disable table auto-numbering
Update README (word count and notes about footers and table labels), edit docs/articulo.md for wording and clarity across SOAP/REST/gRPC/GraphQL sections, and replace docs/Tarea3-EstilosIntegracionAPIs.docx (binary change). Modify scripts/build_docx.py to disable the template's 'table head' auto-numbering so Spanish table captions from the .md are not duplicated; add explanatory comments. Small phrasing and table-caption formatting fixes included.
</commit_message>
<xml_diff>
--- a/docs/Tarea3-EstilosIntegracionAPIs.docx
+++ b/docs/Tarea3-EstilosIntegracionAPIs.docx
@@ -151,7 +151,7 @@
         <w:pStyle w:val="BodyText"/>
       </w:pPr>
       <w:r>
-        <w:t>Este artículo responde a las cuatro preguntas que suelen surgir en cualquier discusión sobre el tema. ¿Qué estilos existen realmente disponibles hoy? ¿Cuáles son las características que distinguen a cada uno? ¿Qué limitaciones traen consigo, incluidas las que la documentación oficial no destaca? ¿Y qué criterios permiten escoger con fundamento? El alcance se limita a los cuatro estilos con mayor adopción documentada: SOAP, REST, gRPC y GraphQL. Se excluyen deliberadamente los estilos orientados a eventos, como la mensajería asíncrona con colas o la publicación y suscripción, porque resuelven un problema distinto —la comunicación desacoplada en el tiempo— y merecen un tratamiento propio.</w:t>
+        <w:t>Este artículo responde a las cuatro preguntas que suelen surgir en cualquier discusión sobre el tema. ¿Qué estilos existen realmente disponibles hoy? ¿Cuáles son las características que distinguen a cada uno? ¿Qué limitaciones traen consigo, incluidas las que la documentación oficial no destaca? ¿Y qué criterios permiten escoger con fundamento? El alcance se limita a cuatro de los estilos de integración más utilizados y documentados: SOAP, REST, gRPC y GraphQL. Se excluyen deliberadamente los estilos orientados a eventos, como la mensajería asíncrona con colas o la publicación y suscripción, porque resuelven un problema distinto —la comunicación desacoplada en el tiempo— y merecen un tratamiento propio.</w:t>
       </w:r>
     </w:p>
     <w:p>
@@ -247,7 +247,7 @@
         <w:pStyle w:val="BodyText"/>
       </w:pPr>
       <w:r>
-        <w:t>Las limitaciones son igual de nítidas. El sobre XML es verboso: una consulta de saldo puede ocupar varios kilobytes de los cuales apenas una fracción es información útil. El procesamiento requiere análisis sintáctico de XML, más costoso que el de formatos binarios o JSON. La curva de aprendizaje es pronunciada y el soporte en lenguajes modernos y en navegadores es marginal. Y la rigidez que protege también inmoviliza: modificar el contrato obliga a coordinar a todos los consumidores. Hoy SOAP sobrevive sobre todo como tecnología heredada en sectores regulados, y esa condición no es un defecto sino el reflejo de que cumple bien un requisito específico.</w:t>
+        <w:t>Las limitaciones son igual de nítidas. El sobre XML es verboso: una consulta de saldo puede ocupar varios kilobytes de los cuales apenas una fracción es información útil. El procesamiento requiere análisis sintáctico de XML, más costoso que el de formatos binarios o JSON. La curva de aprendizaje es pronunciada y el soporte en lenguajes modernos y en navegadores es marginal. Y la rigidez que protege también inmoviliza: modificar el contrato obliga a coordinar a todos los consumidores. Actualmente SOAP mantiene una presencia relevante sobre todo en sistemas heredados y en sectores con requisitos empresariales o regulatorios específicos, y esa condición no es un defecto sino el reflejo de que cumple bien un requisito concreto.</w:t>
       </w:r>
     </w:p>
     <w:p>
@@ -279,7 +279,7 @@
         <w:pStyle w:val="BodyText"/>
       </w:pPr>
       <w:r>
-        <w:t xml:space="preserve">Sus limitaciones surgen del mismo origen. La primera es la imprecisión de los datos devueltos: un recurso tiene una representación fija, de modo que el cliente recibe campos que no necesita —sobrecarga o </w:t>
+        <w:t>Sus limitaciones surgen del mismo origen. La primera es la imprecisión de los datos devueltos: un recurso tiene una representación fija, de modo que el cliente recibe campos que no necesita —sobrecarga de datos (</w:t>
       </w:r>
       <w:r>
         <w:rPr>
@@ -288,7 +288,7 @@
         <w:t>over-fetching</w:t>
       </w:r>
       <w:r>
-        <w:t xml:space="preserve">— o debe hacer varias llamadas para completar lo que sí necesita —insuficiencia o </w:t>
+        <w:t>)— o debe hacer varias llamadas para completar lo que sí necesita —insuficiencia de datos (</w:t>
       </w:r>
       <w:r>
         <w:rPr>
@@ -297,7 +297,7 @@
         <w:t>under-fetching</w:t>
       </w:r>
       <w:r>
-        <w:t>—. Una pantalla de perfil que muestre el usuario, sus últimos pedidos y sus direcciones puede requerir tres peticiones encadenadas. La segunda es que REST carece de un contrato obligatorio; OpenAPI cubre ese vacío, pero es una convención añadida y no una garantía del estilo. La tercera es que la disciplina real es escasa: Fowler (2010), al popularizar el modelo de madurez de Richardson, mostró que muchas APIs autodenominadas REST se detienen en el uso de URLs y verbos y nunca alcanzan la interfaz uniforme completa.</w:t>
+        <w:t>)—. Una pantalla de perfil que muestre el usuario, sus últimos pedidos y sus direcciones puede requerir tres peticiones encadenadas. La segunda es que REST carece de un contrato obligatorio; OpenAPI cubre ese vacío, pero es una convención añadida y no una garantía del estilo. La tercera es que la disciplina real es escasa: Fowler (2010), al popularizar el modelo de madurez de Richardson, mostró que muchas APIs autodenominadas REST se detienen en el uso de URLs y verbos y nunca alcanzan la interfaz uniforme completa.</w:t>
       </w:r>
     </w:p>
     <w:p>
@@ -330,7 +330,7 @@
         <w:pStyle w:val="BodyText"/>
       </w:pPr>
       <w:r>
-        <w:t>Las tres decisiones anteriores explican su rendimiento. La serialización binaria produce cargas útiles considerablemente menores que las de JSON o XML equivalentes. HTTP/2 multiplexa varias llamadas sobre una misma conexión y evita el bloqueo de cabecera de línea. Y el código generado elimina la escritura manual de clientes. A eso se añade el soporte nativo de cuatro modos de comunicación, incluidos el flujo continuo desde el servidor, desde el cliente y bidireccional, algo que REST solo consigue con mecanismos adicionales (gRPC Authors, 2024). Por eso Newman (2021) lo señala como opción natural para comunicación interna entre microservicios, donde la latencia acumulada de decenas de llamadas por petición sí se percibe.</w:t>
+        <w:t>Las tres decisiones anteriores explican su rendimiento. La serialización binaria produce cargas útiles considerablemente menores que las de JSON o XML equivalentes. HTTP/2 multiplexa varias llamadas sobre una misma conexión y reduce el bloqueo entre solicitudes característico de HTTP/1.1, aunque la pérdida de paquetes todavía puede provocar bloqueo en la capa de transporte TCP. Y el código generado elimina la escritura manual de clientes. A eso se añade el soporte nativo de cuatro modos de comunicación, incluidos el flujo continuo desde el servidor, desde el cliente y bidireccional, algo que REST solo consigue con mecanismos adicionales (gRPC Authors, 2024). Por eso Newman (2021) lo señala como opción natural para comunicación interna entre microservicios, donde la latencia acumulada de decenas de llamadas por petición sí se percibe.</w:t>
       </w:r>
     </w:p>
     <w:p>
@@ -338,7 +338,7 @@
         <w:pStyle w:val="BodyText"/>
       </w:pPr>
       <w:r>
-        <w:t xml:space="preserve">Las limitaciones son de contexto más que de diseño. Los navegadores no pueden consumir gRPC directamente y requieren una capa intermedia como gRPC-Web, lo que lo descarta como API pública para clientes web. El formato binario no es legible por humanos, de modo que depurar exige herramientas específicas en lugar de un simple </w:t>
+        <w:t xml:space="preserve">Las limitaciones son de contexto más que de diseño. Los navegadores no pueden utilizar directamente el protocolo gRPC nativo, que depende de capacidades de HTTP/2 no expuestas a las aplicaciones web, y normalmente requieren gRPC-Web o una pasarela intermediaria, lo que resta atractivo a gRPC como API pública para clientes web. El formato binario no es legible por humanos, de modo que depurar exige herramientas específicas en lugar de un simple </w:t>
       </w:r>
       <w:r>
         <w:rPr>
@@ -379,7 +379,7 @@
         <w:pStyle w:val="BodyText"/>
       </w:pPr>
       <w:r>
-        <w:t>Sus limitaciones son principalmente operativas. Como toda la comunicación ocurre por POST hacia un mismo punto de entrada, la caché de HTTP deja de funcionar y debe reemplazarse por caché en el cliente o por capas especializadas. La observabilidad se complica: los códigos de estado y las métricas por ruta pierden significado cuando todas las peticiones comparten la misma URL, y un error puede llegar con estado 200. El riesgo más serio es de disponibilidad: Hartig y Pérez (2018) demostraron que una consulta anidada puede crecer de forma exponencial y que evaluarla es computacionalmente costoso, por lo que un servicio expuesto sin límites de profundidad, de complejidad ni presupuesto de consulta queda vulnerable a agotamiento de recursos. OWASP (2023) recoge este patrón entre los riesgos habituales de las APIs modernas. Finalmente, el problema conocido como N+1 obliga a introducir agrupadores de carga para evitar que una consulta elegante genere cientos de accesos a la base de datos.</w:t>
+        <w:t>Sus limitaciones son principalmente operativas. Como la mayoría de las implementaciones concentran sus operaciones en un único punto de entrada y utilizan principalmente POST, el aprovechamiento de la caché de HTTP resulta mucho menos directo que en REST y suele reemplazarse por caché en el cliente o por capas especializadas. La observabilidad se complica: los códigos de estado y las métricas por ruta pierden significado cuando todas las peticiones comparten la misma URL, y un error puede llegar con estado 200. El riesgo más serio es de disponibilidad: Hartig y Pérez (2018) demostraron que una consulta anidada puede crecer de forma exponencial y que evaluarla es computacionalmente costoso, por lo que un servicio expuesto sin límites de profundidad, de complejidad ni presupuesto de consulta queda vulnerable a agotamiento de recursos. OWASP (2023) recoge este patrón entre los riesgos habituales de las APIs modernas. Finalmente, el problema conocido como N+1 obliga a introducir agrupadores de carga para evitar que una consulta elegante genere cientos de accesos a la base de datos.</w:t>
       </w:r>
     </w:p>
     <w:p>
@@ -411,6 +411,10 @@
     <w:p>
       <w:pPr>
         <w:pStyle w:val="tablehead"/>
+        <w:numPr>
+          <w:ilvl w:val="0"/>
+          <w:numId w:val="0"/>
+        </w:numPr>
       </w:pPr>
       <w:r>
         <w:t>Tabla I. Comparación de los cuatro estilos según la rejilla de nueve criterios</w:t>
@@ -1125,7 +1129,7 @@
             </w:pPr>
             <w:r/>
             <w:r>
-              <w:t>Curva media-alta, buen tooling</w:t>
+              <w:t>Curva media-alta, buenas herramientas de desarrollo</w:t>
             </w:r>
           </w:p>
         </w:tc>
@@ -1247,6 +1251,10 @@
     <w:p>
       <w:pPr>
         <w:pStyle w:val="tablehead"/>
+        <w:numPr>
+          <w:ilvl w:val="0"/>
+          <w:numId w:val="0"/>
+        </w:numPr>
       </w:pPr>
       <w:r>
         <w:t>Tabla II. Limitaciones y costos ocultos por estilo</w:t>
@@ -1546,6 +1554,10 @@
     <w:p>
       <w:pPr>
         <w:pStyle w:val="tablehead"/>
+        <w:numPr>
+          <w:ilvl w:val="0"/>
+          <w:numId w:val="0"/>
+        </w:numPr>
       </w:pPr>
       <w:r>
         <w:t>Tabla III. Matriz de decisión por escenario</w:t>

</xml_diff>